<commit_message>
court(mich-sc/petition-for-writ): latex and docx regenerated on the model of fb-595.54.82, latex gated, docx reported (fb-595.54.31)
Co-Authored-By: Claude Opus 5.5 <noreply@anthropic.com>

(fb-595.54.31)
</commit_message>
<xml_diff>
--- a/courts/sixth-circuit/michigan/state/supreme-court/petition-for-writ/usage/OUTPUT-petition-for-writ.docx
+++ b/courts/sixth-circuit/michigan/state/supreme-court/petition-for-writ/usage/OUTPUT-petition-for-writ.docx
@@ -980,7 +980,7 @@
         <w:pStyle w:val="XdQuoteFirst"/>
       </w:pPr>
       <w:r>
-        <w:t xml:space="preserve">(1) A person who circulates a petition . . . may, before circulating any petition, submit the summary of the purpose of the proposed amendment or question proposed . . . to the board of state canvassers for approval as to the content of the summary. The board of state canvassers must issue an approval or rejection of the content of the summary not more than 30 days after the summary is submitted. . . .</w:t>
+        <w:t xml:space="preserve">(1) A person who circulates a petition . . . may, before circulating any petition, submit the summary of the purpose of the proposed amendment or question proposed . . . to the board of state canvassers for approval as to the content of the summary. The board of state canvassers must issue an approval or rejection of the content of the summary not more than 30 days after the summary is submitted. . . .</w:t>
       </w:r>
     </w:p>
     <w:p>
@@ -1036,7 +1036,7 @@
         <w:pStyle w:val="BodyText"/>
       </w:pPr>
       <w:r>
-        <w:t xml:space="preserve">7. Raise the Wage MI used this process. On December 22, 2021, Raise the Wage MI submitted a proposed summary. The Director of Elections prepared a summary that was reviewed by the BOSC at its meeting on January 19, 2022, where there was ample opportunity for public input and comment. The summary was unanimously approved by the BOSC that day. See Board of State Canvassers, Meeting Minutes (January 19, 2022), available at https://www.michigan.gov/​sos/-/​media/​Project/​Websites/​sos/​BSC-Meeting-Minutes/​Jan</w:t>
+        <w:t xml:space="preserve">7. Raise the Wage MI used this process. On December 22, 2021, Raise the Wage MI submitted a proposed summary. The Director of Elections prepared a summary that was reviewed by the BOSC at its meeting on January 19, 2022, where there was ample opportunity for public input and comment. The summary was unanimously approved by the BOSC that day. See Board of State Canvassers, Meeting Minutes (January 19, 2022), available at https://​www.​michigan.​gov/​sos/​-/​media/​Project/​Websites/​sos/​BSC-​Meeting-​Minutes/​Jan</w:t>
       </w:r>
       <w:r>
         <w:noBreakHyphen/>
@@ -1048,7 +1048,7 @@
         <w:noBreakHyphen/>
       </w:r>
       <w:r>
-        <w:t xml:space="preserve">2022-BSC-Meeting-Minutes.pdf?rev=18c5c028324545b2b6721e7ceeda2bf7&amp;hash=76070B5A61DBB0F0A5797F8E42DFB241.</w:t>
+        <w:t xml:space="preserve">2022-​BSC-​Meeting-​Minutes.​pdf?​rev=18c5c028324545b2b6721e7ceeda2bf7&amp;hash=76070B5A61DBB0F0A5797F8E42DFB241.</w:t>
       </w:r>
     </w:p>
     <w:p>
@@ -1222,7 +1222,7 @@
         <w:pStyle w:val="BodyText"/>
       </w:pPr>
       <w:r>
-        <w:t xml:space="preserve">11. To assist ballot proposal sponsors in avoiding disqualification due to defects in their petition forms, the BOSC has also established a process for reviewing and approving the form of ballot proposal petitions before they are circulated. See Department of State, Bureau of Elections, Sponsoring a Statewide Initiative, Referendum or Constitutional Amendment Petition (February 2022), pp 9–10, available at https://www.michigan.gov/-/​media/​Project/​Websites/​sos/08delrio/​Initiative_and_Referendum_Petition_Instructions_201920_061119.pdf?rev=298aaf6a87224081a047796dc17a9d07.</w:t>
+        <w:t xml:space="preserve">11. To assist ballot proposal sponsors in avoiding disqualification due to defects in their petition forms, the BOSC has also established a process for reviewing and approving the form of ballot proposal petitions before they are circulated. See Department of State, Bureau of Elections, Sponsoring a Statewide Initiative, Referendum or Constitutional Amendment Petition (February 2022), pp 9–10, available at https://​www.​michigan.​gov/​-/​media/​Project/​Websites/​sos/​08delrio/​Initiative_and_Referendum_Petition_Instructions_201920_061119.​pdf?​rev=298aaf6a87224081a047796dc17a9d07.</w:t>
       </w:r>
     </w:p>
     <w:p>
@@ -1360,7 +1360,7 @@
         <w:t xml:space="preserve">Raise the Wage MI</w:t>
       </w:r>
       <w:r>
-        <w:t xml:space="preserve">, the BOSC met on March 23, 2022, and unanimously approved the form of the petition submitted by Raise the Wage MI on March 10, 2022. See Board of State Canvassers, Meeting Minutes (March 23, 2022), available at https://www.michigan.gov/​sos/-/​media/​Project/​Websites/​sos/​BSC-Meeting-Minutes/​Signed</w:t>
+        <w:t xml:space="preserve">, the BOSC met on March 23, 2022, and unanimously approved the form of the petition submitted by Raise the Wage MI on March 10, 2022. See Board of State Canvassers, Meeting Minutes (March 23, 2022), available at https://​www.​michigan.​gov/​sos/​-/​media/​Project/​Websites/​sos/​BSC-​Meeting-​Minutes/​Signed</w:t>
       </w:r>
       <w:r>
         <w:noBreakHyphen/>
@@ -1378,7 +1378,7 @@
         <w:noBreakHyphen/>
       </w:r>
       <w:r>
-        <w:t xml:space="preserve">2022-Meeting-Minutes.pdf?rev=527a925174c241d290d707340a078918&amp;hash=C0E121360E1F4417C6E43AF389771F26.</w:t>
+        <w:t xml:space="preserve">2022-​Meeting-​Minutes.​pdf?​rev=527a925174c241d290d707340a078918&amp;hash=C0E121360E1F4417C6E43AF389771F26.</w:t>
       </w:r>
     </w:p>
     <w:p>
@@ -2306,7 +2306,7 @@
         <w:t xml:space="preserve">Reproductive Freedom for All v Bd of State Canvassers</w:t>
       </w:r>
       <w:r>
-        <w:t xml:space="preserve">, 510 Mich 894, 894–895; 978 NW2d 854 (2022) (where the form of a petition is sufficient and there are enough signatures, “the Board . . . has a clear legal duty to certify the petition”);</w:t>
+        <w:t xml:space="preserve">, 510 Mich 894, 894–895; 978 NW2d 854 (2022) (where the form of a petition is sufficient and there are enough signatures, “the Board . . . has a clear legal duty to certify the petition”);</w:t>
       </w:r>
       <w:r>
         <w:t xml:space="preserve"> </w:t>
@@ -2332,7 +2332,7 @@
         <w:t xml:space="preserve">Citizens for Protection of Marriage v Bd of State Canvassers</w:t>
       </w:r>
       <w:r>
-        <w:t xml:space="preserve">, 263 Mich App 487, 493; 688 NW2d 538 (2004) (per curiam) (“[T]he Board approved the form of the petition and there is no dispute that there are sufficient signatures. . . . [T]he Board was obligated to certify the petition.”).</w:t>
+        <w:t xml:space="preserve">, 263 Mich App 487, 493; 688 NW2d 538 (2004) (per curiam) (“[T]he Board approved the form of the petition and there is no dispute that there are sufficient signatures. . . . [T]he Board was obligated to certify the petition.”).</w:t>
       </w:r>
     </w:p>
     <w:p>
@@ -3899,6 +3899,7 @@
     <w:unhideWhenUsed/>
     <w:qFormat/>
     <w:pPr>
+      <w:keepLines/>
       <w:spacing w:before="0" w:after="120" w:line="276" w:lineRule="exact"/>
     </w:pPr>
     <w:rPr>
@@ -4149,6 +4150,33 @@
     <w:pPr>
       <w:spacing w:before="0" w:after="0" w:line="276" w:lineRule="exact"/>
       <w:ind w:left="2160" w:hanging="720"/>
+    </w:pPr>
+  </w:style>
+  <w:style w:type="paragraph" w:customStyle="1" w:styleId="XdQuoteList1">
+    <w:name w:val="Xd Quote List 1"/>
+    <w:basedOn w:val="Normal"/>
+    <w:qFormat/>
+    <w:pPr>
+      <w:spacing w:before="0" w:after="0" w:line="276" w:lineRule="exact"/>
+      <w:ind w:left="1440" w:right="720" w:hanging="720"/>
+    </w:pPr>
+  </w:style>
+  <w:style w:type="paragraph" w:customStyle="1" w:styleId="XdQuoteList2">
+    <w:name w:val="Xd Quote List 2"/>
+    <w:basedOn w:val="Normal"/>
+    <w:qFormat/>
+    <w:pPr>
+      <w:spacing w:before="0" w:after="0" w:line="276" w:lineRule="exact"/>
+      <w:ind w:left="2160" w:right="720" w:hanging="720"/>
+    </w:pPr>
+  </w:style>
+  <w:style w:type="paragraph" w:customStyle="1" w:styleId="XdQuoteList3">
+    <w:name w:val="Xd Quote List 3"/>
+    <w:basedOn w:val="Normal"/>
+    <w:qFormat/>
+    <w:pPr>
+      <w:spacing w:before="0" w:after="0" w:line="276" w:lineRule="exact"/>
+      <w:ind w:left="2880" w:right="720" w:hanging="720"/>
     </w:pPr>
   </w:style>
   <w:style w:type="paragraph" w:customStyle="1" w:styleId="XdQuote">

</xml_diff>